<commit_message>
docs: update v2 note and docx with Giscus ID GraphQL API query guide
</commit_message>
<xml_diff>
--- a/20260803_Hugo部落格AI自動化建置與踩坑全紀錄_v2.docx
+++ b/20260803_Hugo部落格AI自動化建置與踩坑全紀錄_v2.docx
@@ -20,7 +20,7 @@
     </w:p>
     <w:p>
       <w:r>
-        <w:t>&gt; 💡 **本指南說明**：這是一份**「拿到就能 100% 複製」**的實戰手冊。無論是您自己未來要重蓋網站，或是分享給其他人，只要依序執行以下 10 個階段的指令與設定，即可從零搭建出包含 **Dream 炫麗主題、Giscus 留言板、WebP 圖片自動壓縮、動態訪客計數器** 以及 **GitHub Actions 30秒自動化雲端部署** 的專業個人部落格！</w:t>
+        <w:t>&gt; 💡 **本指南說明**：這是一份**「拿到就能 100% 複製」**的實戰手冊。無論是您自己未來要重蓋網站，或是分享給其他人，只要依序執行以下 10 個階段的指令與設定，即可從零搭建出包含 **Dream 炫麗主題、Giscus 留言板 (包含實體與 GraphQL API 自動查詢雙 ID 手法)、WebP 圖片自動壓縮、動態訪客計數器** 以及 **GitHub Actions 30秒自動化雲端部署** 的專業個人部落格！</w:t>
       </w:r>
     </w:p>
     <w:p>
@@ -135,7 +135,7 @@
         <w:pStyle w:val="Heading2"/>
       </w:pPr>
       <w:r>
-        <w:t>⚙️ 第五階段：配置核心設定檔 `hugo.toml`</w:t>
+        <w:t>⚙️ 第五階段：配置核心設定檔 `hugo.toml` (含 Giscus 實體 ID)</w:t>
       </w:r>
     </w:p>
     <w:p>
@@ -193,7 +193,7 @@
         <w:t xml:space="preserve">  showSummaryCoverInPost = true</w:t>
         <w:br/>
         <w:br/>
-        <w:t xml:space="preserve">  # Giscus 留言板設定 (在 https://giscus.app/zh-TW 取得您的 Repo ID 與 Category ID)</w:t>
+        <w:t xml:space="preserve">  # Giscus 留言板真實設定 (已填入真實專屬 Repo ID 與 Category ID)</w:t>
         <w:br/>
         <w:t xml:space="preserve">  [params.giscus]</w:t>
         <w:br/>
@@ -201,11 +201,11 @@
         <w:br/>
         <w:t xml:space="preserve">    repo = "lkoj74/hugo-0803"</w:t>
         <w:br/>
-        <w:t xml:space="preserve">    repoId = "R_kgDOXXXXXXXX"</w:t>
+        <w:t xml:space="preserve">    repoId = "R_kgDOTr-TZw"</w:t>
         <w:br/>
         <w:t xml:space="preserve">    category = "Announcements"</w:t>
         <w:br/>
-        <w:t xml:space="preserve">    categoryId = "DIC_kwDOXXXXXXXX"</w:t>
+        <w:t xml:space="preserve">    categoryId = "DIC_kwDOTr-TZ84DCj-M"</w:t>
         <w:br/>
         <w:br/>
         <w:t>[menu]</w:t>
@@ -241,6 +241,59 @@
         <w:t xml:space="preserve">    url = "about/"</w:t>
         <w:br/>
         <w:t xml:space="preserve">    weight = 30</w:t>
+      </w:r>
+    </w:p>
+    <w:p>
+      <w:pPr>
+        <w:pStyle w:val="Heading3"/>
+      </w:pPr>
+      <w:r>
+        <w:t>💡 專用指南：如何獲取 Giscus 專屬 ID 的雙重途徑</w:t>
+      </w:r>
+    </w:p>
+    <w:p>
+      <w:r>
+        <w:t>#### 途徑 A（AI / GitHub CLI GraphQL 快捷查詢法 - 推薦）：</w:t>
+      </w:r>
+    </w:p>
+    <w:p>
+      <w:pPr/>
+      <w:r>
+        <w:t>gh api graphql -F owner="您的GitHub帳號" -F name="倉庫名稱" -f query='query($owner: String!, $name: String!) { repository(owner: $owner, name: $name) { id discussionCategories(first: 10) { nodes { id name } } } }'</w:t>
+      </w:r>
+    </w:p>
+    <w:p>
+      <w:r>
+        <w:t>直接返回 `repoId` (例如 `R_kgDOTr-TZw`) 與 `categoryId` (例如 `DIC_kwDOTr-TZ84DCj-M`)。</w:t>
+      </w:r>
+    </w:p>
+    <w:p>
+      <w:r>
+        <w:t>#### 途徑 B（網頁查詢法）：</w:t>
+      </w:r>
+    </w:p>
+    <w:p>
+      <w:pPr>
+        <w:pStyle w:val="ListNumber"/>
+      </w:pPr>
+      <w:r>
+        <w:t>1. 進入 GitHub 倉庫設定 ➔ 開啟 **`Discussions`** 討論區。</w:t>
+      </w:r>
+    </w:p>
+    <w:p>
+      <w:pPr>
+        <w:pStyle w:val="ListNumber"/>
+      </w:pPr>
+      <w:r>
+        <w:t>2. 前往 **[https://giscus.app/zh-TW](https://giscus.app/zh-TW)** 輸入 `帳號/倉庫名稱`。</w:t>
+      </w:r>
+    </w:p>
+    <w:p>
+      <w:pPr>
+        <w:pStyle w:val="ListNumber"/>
+      </w:pPr>
+      <w:r>
+        <w:t>3. 討論區分類選取 `Announcements`，網頁下方即會自動生成兩組 ID。</w:t>
       </w:r>
     </w:p>
     <w:p>
@@ -317,7 +370,7 @@
         <w:t>Set-Content -Path .nojekyll -Value "# Disable Jekyll"</w:t>
         <w:br/>
         <w:br/>
-        <w:t># 2. 提交並推送到 GitHub main 分支</w:t>
+        <w:t># 2. 提交並推送到 GitHub main分支</w:t>
         <w:br/>
         <w:t>git add .</w:t>
         <w:br/>
@@ -417,7 +470,7 @@
     </w:p>
     <w:p>
       <w:r>
-        <w:t>| 4~5 階段 | 下載 Dream 主題與設定 `hugo.toml` | **務必刪除 `themes/dream/.git`** |</w:t>
+        <w:t>| 4~5 階段 | 下載 Dream 主題與設定 `hugo.toml` | **務必刪除 `themes/dream/.git`**（Giscus 已自動配置實體 ID `R_kgDOTr-TZw` 與 `DIC_kwDOTr-TZ84DCj-M`） |</w:t>
       </w:r>
     </w:p>
     <w:p>

</xml_diff>

<commit_message>
feat: install Decap CMS admin backend for online post management
</commit_message>
<xml_diff>
--- a/20260803_Hugo部落格AI自動化建置與踩坑全紀錄_v2.docx
+++ b/20260803_Hugo部落格AI自動化建置與踩坑全紀錄_v2.docx
@@ -20,7 +20,7 @@
     </w:p>
     <w:p>
       <w:r>
-        <w:t>&gt; 💡 **本指南說明**：這是一份**「拿到就能 100% 複製」**的實戰手冊。無論是您自己未來要重蓋網站，或是分享給其他人，只要依序執行以下 10 個階段的指令與設定，即可從零搭建出包含 **Dream 炫麗主題、Giscus 留言板 (包含實體與 GraphQL API 自動查詢雙 ID 手法)、WebP 圖片自動壓縮、動態訪客計數器** 以及 **GitHub Actions 30秒自動化雲端部署** 的專業個人部落格！</w:t>
+        <w:t>&gt; 💡 **本指南說明**：這是一份**「拿到就能 100% 複製」**的實戰手冊。無論是您自己未來要重蓋網站，或是分享給其他人，只要依序執行以下 10 個階段的指令與設定，即可從零搭建出包含 **Dream 炫麗主題、Giscus 留言板 (含 GraphQL API 自動查詢雙 ID 手法與 Single.html / div.giscus 雙重避坑指南)、WebP 圖片自動壓縮、動態訪客計數器** 以及 **GitHub Actions 30秒自動化雲端部署** 的專業個人部落格！</w:t>
       </w:r>
     </w:p>
     <w:p>
@@ -370,7 +370,7 @@
         <w:t>Set-Content -Path .nojekyll -Value "# Disable Jekyll"</w:t>
         <w:br/>
         <w:br/>
-        <w:t># 2. 提交並推送到 GitHub main分支</w:t>
+        <w:t># 2. 提交並推送到 GitHub main 分支</w:t>
         <w:br/>
         <w:t>git add .</w:t>
         <w:br/>
@@ -384,7 +384,7 @@
         <w:pStyle w:val="Heading3"/>
       </w:pPr>
       <w:r>
-        <w:t>開啟 GitHub Pages（只需在網頁上設定一次）：</w:t>
+        <w:t>開啟 GitHub Pages 與 Giscus App 授權（只需在網頁上設定一次）：</w:t>
       </w:r>
     </w:p>
     <w:p>
@@ -400,15 +400,7 @@
         <w:pStyle w:val="ListNumber"/>
       </w:pPr>
       <w:r>
-        <w:t>2. 進入 **`Settings` ➔ `Pages`**。</w:t>
-      </w:r>
-    </w:p>
-    <w:p>
-      <w:pPr>
-        <w:pStyle w:val="ListNumber"/>
-      </w:pPr>
-      <w:r>
-        <w:t>3. 在 **`Build and deployment`** 區塊：</w:t>
+        <w:t>2. 進入 **`Settings` ➔ `Pages`**：</w:t>
       </w:r>
     </w:p>
     <w:p>
@@ -424,20 +416,28 @@
         <w:pStyle w:val="ListBullet"/>
       </w:pPr>
       <w:r>
-        <w:t>**Branch** 選擇：**`gh-pages`** ➔ 資料夾選 **`/ (root)`**。</w:t>
+        <w:t>**Branch** 選擇：**`gh-pages`** ➔ 資料夾選 **`/ (root)`** ➔ 點擊 **`Save`**。</w:t>
       </w:r>
     </w:p>
     <w:p>
       <w:pPr>
-        <w:pStyle w:val="ListBullet"/>
+        <w:pStyle w:val="ListNumber"/>
       </w:pPr>
       <w:r>
-        <w:t>點擊右側 **`Save` (儲存)**。</w:t>
+        <w:t>3. 進入 **`Settings` ➔ `General` ➔ `Features`** ➔ 勾選開啟 **`Discussions`**。</w:t>
+      </w:r>
+    </w:p>
+    <w:p>
+      <w:pPr>
+        <w:pStyle w:val="ListNumber"/>
+      </w:pPr>
+      <w:r>
+        <w:t>4. 前往 **`https://github.com/apps/giscus`** 點擊 `Install` 授權您的專案倉庫。</w:t>
       </w:r>
     </w:p>
     <w:p>
       <w:r>
-        <w:t>約 **30 秒～ 1 分鐘後**，GitHub Actions 自動發布完成，全網造訪您的公開部落格：</w:t>
+        <w:t>約 **30 秒～ 1 分鐘後**，GitHub Actions 自動發布完成，全網造訪您的公開部落格與留言板：</w:t>
       </w:r>
     </w:p>
     <w:p>
@@ -475,12 +475,17 @@
     </w:p>
     <w:p>
       <w:r>
-        <w:t>| 6~7 階段 | 48px大頭貼保護、計數器、WebP Pipeline | 使用 Page Bundles 資料夾結構 |</w:t>
+        <w:t>| 6 階段 | 修復 Giscus 留言板雙重坑點 | **覆蓋 `layouts/_default/single.html` 加入 `giscus.enabled` 判斷，並補上 `&lt;div class="giscus"&gt;&lt;/div&gt;` 容器** |</w:t>
       </w:r>
     </w:p>
     <w:p>
       <w:r>
-        <w:t>| 8~9 階段 | 配置 `hugo.yml` 與開啟 GitHub Pages | Source 選 `Deploy from a branch` (`gh-pages`) |</w:t>
+        <w:t>| 7 階段 | 48px大頭貼保護、計數器、WebP Pipeline | 使用 Page Bundles 資料夾結構 |</w:t>
+      </w:r>
+    </w:p>
+    <w:p>
+      <w:r>
+        <w:t>| 8~9 階段 | 配置 `hugo.yml` 與開啟 GitHub Pages / Giscus App | Source 選 `Deploy from a branch` (`gh-pages`)，並授權 Giscus App |</w:t>
       </w:r>
     </w:p>
     <w:p>

</xml_diff>